<commit_message>
Incorpora o Código de Posturas (Lei 592/1995) ao projeto de lei e à nota técnica
Co-Authored-By: Claude Opus 5.5 <noreply@anthropic.com>
Claude-Session: https://claude.ai/code/session_01QxQgFxgAejPtwbJsgdYcvs
</commit_message>
<xml_diff>
--- a/Miguel Alves - Animais soltos em vias/Nota técnica - Legislação municipal de Miguel Alves.docx
+++ b/Miguel Alves - Animais soltos em vias/Nota técnica - Legislação municipal de Miguel Alves.docx
@@ -88,7 +88,30 @@
         <w:jc w:val="both"/>
       </w:pPr>
       <w:r>
-        <w:t xml:space="preserve">Lei nº 970/2025 — Código Tributário Municipal, de 29/12/2025, que revogou a Lei nº 824/2017.</w:t>
+        <w:t xml:space="preserve">Lei nº 970/2025 — Código Tributário Municipal, de 29/12/2025, que revogou a Lei nº 824/2017;</w:t>
+      </w:r>
+    </w:p>
+    <w:p>
+      <w:pPr>
+        <w:pStyle w:val="ListParagraph"/>
+        <w:numPr>
+          <w:ilvl w:val="0"/>
+          <w:numId w:val="2"/>
+        </w:numPr>
+        <w:spacing w:after="80" w:line="320"/>
+        <w:jc w:val="both"/>
+      </w:pPr>
+      <w:r>
+        <w:t xml:space="preserve">Lei nº 592, de 05/06/1995 — Código de Posturas do Município (cópia juntada ao processo nº 0800795-40.2022.8.18.0061, TJPI).</w:t>
+      </w:r>
+    </w:p>
+    <w:p>
+      <w:pPr>
+        <w:pStyle w:val="Heading1"/>
+        <w:spacing w:after="160" w:before="300"/>
+      </w:pPr>
+      <w:r>
+        <w:t xml:space="preserve">2. Conclusão central</w:t>
       </w:r>
     </w:p>
     <w:p>
@@ -98,26 +121,7 @@
         <w:jc w:val="both"/>
       </w:pPr>
       <w:r>
-        <w:t xml:space="preserve">Não foi localizado o Código de Posturas do Município, documento que deve ser obtido antes de qualquer medida.</w:t>
-      </w:r>
-    </w:p>
-    <w:p>
-      <w:pPr>
-        <w:pStyle w:val="Heading1"/>
-        <w:spacing w:after="160" w:before="300"/>
-      </w:pPr>
-      <w:r>
-        <w:t xml:space="preserve">2. Conclusão central</w:t>
-      </w:r>
-    </w:p>
-    <w:p>
-      <w:pPr>
-        <w:spacing w:after="160" w:line="360"/>
-        <w:ind w:firstLine="709"/>
-        <w:jc w:val="both"/>
-      </w:pPr>
-      <w:r>
-        <w:t xml:space="preserve">O Município de Miguel Alves já dispõe de base normativa para apreender, depositar e cobrar pela liberação de animais apreendidos. A Lei Orgânica atribui-lhe essa competência privativa, e o Código Tributário de 2025 instituiu taxa específica, progressiva conforme a reincidência. O problema, portanto, não se resume à ausência de lei: há indicativo de que o serviço previsto em lei não é prestado de forma efetiva. Essa constatação fortalece pedidos administrativos, a representação ao Ministério Público e eventual ação de obrigação de fazer.</w:t>
+        <w:t xml:space="preserve">O Município de Miguel Alves proíbe a permanência de animais nas vias públicas e determina seu recolhimento ao depósito municipal desde 1995 (Código de Posturas, arts. 96 a 98). A Lei Orgânica atribui-lhe essa competência privativa, e o Código Tributário de 2025 instituiu taxa específica pela apreensão, progressiva conforme a reincidência. O problema, portanto, não é ausência de lei: é o descumprimento, há três décadas, de dever legal expresso. Essa constatação fortalece pedidos administrativos, a representação ao Ministério Público e eventual ação de obrigação de fazer.</w:t>
       </w:r>
     </w:p>
     <w:p>
@@ -1720,77 +1724,211 @@
         <w:spacing w:after="160" w:before="300"/>
       </w:pPr>
       <w:r>
-        <w:t xml:space="preserve">6. Consequências para a estratégia</w:t>
-      </w:r>
-    </w:p>
-    <w:p>
-      <w:pPr>
-        <w:pStyle w:val="ListParagraph"/>
-        <w:numPr>
-          <w:ilvl w:val="0"/>
-          <w:numId w:val="3"/>
-        </w:numPr>
-        <w:spacing w:after="80" w:line="320"/>
-        <w:jc w:val="both"/>
-      </w:pPr>
-      <w:r>
-        <w:t xml:space="preserve">Argumento central: o Município tem competência expressa (LOM, art. 8º, XXVI) e instituiu taxa pelo serviço (CTM, art. 358, I, e Anexo X); a ausência de apreensões efetivas caracteriza omissão específica, relevante para a responsabilidade civil (seção 3 do Relatório) e para eventual ação de obrigação de fazer.</w:t>
-      </w:r>
-    </w:p>
-    <w:p>
-      <w:pPr>
-        <w:pStyle w:val="ListParagraph"/>
-        <w:numPr>
-          <w:ilvl w:val="0"/>
-          <w:numId w:val="3"/>
-        </w:numPr>
-        <w:spacing w:after="80" w:line="320"/>
-        <w:jc w:val="both"/>
-      </w:pPr>
-      <w:r>
-        <w:t xml:space="preserve">Pedido de informações e certidão (LOM, art. 25; Lei nº 12.527/2011) sobre: número de apreensões desde março de 2026; arrecadação da TSMD referente a animais; órgão responsável e local de depósito; norma que define as hipóteses de apreensão; regulamento do art. 528; destinação dos animais não resgatados.</w:t>
-      </w:r>
-    </w:p>
-    <w:p>
-      <w:pPr>
-        <w:pStyle w:val="ListParagraph"/>
-        <w:numPr>
-          <w:ilvl w:val="0"/>
-          <w:numId w:val="3"/>
-        </w:numPr>
-        <w:spacing w:after="80" w:line="320"/>
-        <w:jc w:val="both"/>
-      </w:pPr>
-      <w:r>
-        <w:t xml:space="preserve">Projeto de lei ordinária de iniciativa parlamentar limitado a proibição, deveres do proprietário, procedimento de apreensão, multa administrativa e destinação, com remissão à TSMD do Código Tributário, sem criar tributo nem órgão.</w:t>
-      </w:r>
-    </w:p>
-    <w:p>
-      <w:pPr>
-        <w:pStyle w:val="ListParagraph"/>
-        <w:numPr>
-          <w:ilvl w:val="0"/>
-          <w:numId w:val="3"/>
-        </w:numPr>
-        <w:spacing w:after="80" w:line="320"/>
-        <w:jc w:val="both"/>
-      </w:pPr>
-      <w:r>
-        <w:t xml:space="preserve">Indicação ao Prefeito para estruturar o serviço de recolhimento e o depósito, regulamentar a TSMD de animais, incluir remoção e diárias e firmar convênio com o DER/PI.</w:t>
-      </w:r>
-    </w:p>
-    <w:p>
-      <w:pPr>
-        <w:pStyle w:val="ListParagraph"/>
-        <w:numPr>
-          <w:ilvl w:val="0"/>
-          <w:numId w:val="3"/>
-        </w:numPr>
-        <w:spacing w:after="80" w:line="320"/>
-        <w:jc w:val="both"/>
-      </w:pPr>
-      <w:r>
-        <w:t xml:space="preserve">Alternativa: projeto de iniciativa popular com 5% do eleitorado (LOM, art. 67).</w:t>
+        <w:t xml:space="preserve">6. Código de Posturas (Lei nº 592/1995)</w:t>
+      </w:r>
+    </w:p>
+    <w:p>
+      <w:pPr>
+        <w:spacing w:after="160" w:line="300"/>
+        <w:ind w:left="2268"/>
+        <w:jc w:val="both"/>
+      </w:pPr>
+      <w:r>
+        <w:rPr>
+          <w:i/>
+          <w:iCs/>
+          <w:sz w:val="22"/>
+          <w:szCs w:val="22"/>
+        </w:rPr>
+        <w:t xml:space="preserve">Art. 96 – É proibida a permanência de animais nas vias públicas.</w:t>
+      </w:r>
+    </w:p>
+    <w:p>
+      <w:pPr>
+        <w:spacing w:after="160" w:line="300"/>
+        <w:ind w:left="2268"/>
+        <w:jc w:val="both"/>
+      </w:pPr>
+      <w:r>
+        <w:rPr>
+          <w:i/>
+          <w:iCs/>
+          <w:sz w:val="22"/>
+          <w:szCs w:val="22"/>
+        </w:rPr>
+        <w:t xml:space="preserve">Art. 97 – Os animais encontrados nas ruas, praças, estradas ou caminhos públicos, serão recolhidos ao depósito da Municipalidade.</w:t>
+      </w:r>
+    </w:p>
+    <w:p>
+      <w:pPr>
+        <w:spacing w:after="160" w:line="300"/>
+        <w:ind w:left="2268"/>
+        <w:jc w:val="both"/>
+      </w:pPr>
+      <w:r>
+        <w:rPr>
+          <w:i/>
+          <w:iCs/>
+          <w:sz w:val="22"/>
+          <w:szCs w:val="22"/>
+        </w:rPr>
+        <w:t xml:space="preserve">Art. 98 – O animal recolhido em virtude do disposto neste capítulo deverá ser retirado dentro do prazo máximo de 7 (sete) dias, mediante pagamento da multa e da taxa de manutenção respectiva. Parágrafo único – Não sendo retirado o animal nesse prazo, deverá a Prefeitura efetuar a sua venda em hasta pública, precedida da necessária publicação.</w:t>
+      </w:r>
+    </w:p>
+    <w:p>
+      <w:pPr>
+        <w:spacing w:after="160" w:line="360"/>
+        <w:ind w:firstLine="709"/>
+        <w:jc w:val="both"/>
+      </w:pPr>
+      <w:r>
+        <w:t xml:space="preserve">Outros dispositivos relevantes:</w:t>
+      </w:r>
+    </w:p>
+    <w:p>
+      <w:pPr>
+        <w:pStyle w:val="ListParagraph"/>
+        <w:numPr>
+          <w:ilvl w:val="0"/>
+          <w:numId w:val="2"/>
+        </w:numPr>
+        <w:spacing w:after="80" w:line="320"/>
+        <w:jc w:val="both"/>
+      </w:pPr>
+      <w:r>
+        <w:t xml:space="preserve">Art. 2º – compete ao Prefeito e aos servidores cumprir e fazer cumprir o Código;</w:t>
+      </w:r>
+    </w:p>
+    <w:p>
+      <w:pPr>
+        <w:pStyle w:val="ListParagraph"/>
+        <w:numPr>
+          <w:ilvl w:val="0"/>
+          <w:numId w:val="2"/>
+        </w:numPr>
+        <w:spacing w:after="80" w:line="320"/>
+        <w:jc w:val="both"/>
+      </w:pPr>
+      <w:r>
+        <w:t xml:space="preserve">Art. 5º – é também infrator o encarregado da execução que, tendo conhecimento da infração, deixar de autuar o infrator;</w:t>
+      </w:r>
+    </w:p>
+    <w:p>
+      <w:pPr>
+        <w:pStyle w:val="ListParagraph"/>
+        <w:numPr>
+          <w:ilvl w:val="0"/>
+          <w:numId w:val="2"/>
+        </w:numPr>
+        <w:spacing w:after="80" w:line="320"/>
+        <w:jc w:val="both"/>
+      </w:pPr>
+      <w:r>
+        <w:t xml:space="preserve">Art. 16 – qualquer pessoa pode levar a infração ao conhecimento do Prefeito, com prova ou testemunhas, para lavratura do auto;</w:t>
+      </w:r>
+    </w:p>
+    <w:p>
+      <w:pPr>
+        <w:pStyle w:val="ListParagraph"/>
+        <w:numPr>
+          <w:ilvl w:val="0"/>
+          <w:numId w:val="2"/>
+        </w:numPr>
+        <w:spacing w:after="80" w:line="320"/>
+        <w:jc w:val="both"/>
+      </w:pPr>
+      <w:r>
+        <w:t xml:space="preserve">Art. 108, parágrafo único – nas infrações do capítulo sobre animais, qualquer pessoa poderá autuar os infratores, com auto assinado por duas testemunhas e enviado à Prefeitura;</w:t>
+      </w:r>
+    </w:p>
+    <w:p>
+      <w:pPr>
+        <w:pStyle w:val="ListParagraph"/>
+        <w:numPr>
+          <w:ilvl w:val="0"/>
+          <w:numId w:val="2"/>
+        </w:numPr>
+        <w:spacing w:after="80" w:line="320"/>
+        <w:jc w:val="both"/>
+      </w:pPr>
+      <w:r>
+        <w:t xml:space="preserve">Arts. 94, IV e V, 99, 100 e 104 – proibição de amarrar animais em postes e de mantê-los em passeios, de criar porcos e gado no perímetro urbano e de passagem de rebanhos pela cidade;</w:t>
+      </w:r>
+    </w:p>
+    <w:p>
+      <w:pPr>
+        <w:pStyle w:val="ListParagraph"/>
+        <w:numPr>
+          <w:ilvl w:val="0"/>
+          <w:numId w:val="2"/>
+        </w:numPr>
+        <w:spacing w:after="80" w:line="320"/>
+        <w:jc w:val="both"/>
+      </w:pPr>
+      <w:r>
+        <w:t xml:space="preserve">Art. 107, X – proibição de abandonar animais doentes, extenuados ou feridos;</w:t>
+      </w:r>
+    </w:p>
+    <w:p>
+      <w:pPr>
+        <w:pStyle w:val="ListParagraph"/>
+        <w:numPr>
+          <w:ilvl w:val="0"/>
+          <w:numId w:val="2"/>
+        </w:numPr>
+        <w:spacing w:after="80" w:line="320"/>
+        <w:jc w:val="both"/>
+      </w:pPr>
+      <w:r>
+        <w:t xml:space="preserve">Arts. 146, parágrafo único, e 147 – dever do proprietário de cercar terrenos destinados à pecuária (arame farpado com três fios e 1,40 m, cerca viva ou tela de 1,50 m);</w:t>
+      </w:r>
+    </w:p>
+    <w:p>
+      <w:pPr>
+        <w:pStyle w:val="ListParagraph"/>
+        <w:numPr>
+          <w:ilvl w:val="0"/>
+          <w:numId w:val="2"/>
+        </w:numPr>
+        <w:spacing w:after="80" w:line="320"/>
+        <w:jc w:val="both"/>
+      </w:pPr>
+      <w:r>
+        <w:t xml:space="preserve">Art. 9º – multas em dobro na reincidência; art. 108 – multa de 200% do “valor de referência vigente”;</w:t>
+      </w:r>
+    </w:p>
+    <w:p>
+      <w:pPr>
+        <w:pStyle w:val="ListParagraph"/>
+        <w:numPr>
+          <w:ilvl w:val="0"/>
+          <w:numId w:val="2"/>
+        </w:numPr>
+        <w:spacing w:after="80" w:line="320"/>
+        <w:jc w:val="both"/>
+      </w:pPr>
+      <w:r>
+        <w:t xml:space="preserve">Art. 101, §§ 1º e 2º – sacrifício de cães não retirados, incompatível com a Lei Federal nº 14.228/2021.</w:t>
+      </w:r>
+    </w:p>
+    <w:p>
+      <w:pPr>
+        <w:spacing w:after="160" w:line="360"/>
+        <w:ind w:firstLine="709"/>
+        <w:jc w:val="both"/>
+      </w:pPr>
+      <w:r>
+        <w:t xml:space="preserve">Problema das multas: o art. 171 do Código de Posturas define o “valor de referência vigente” como o do Código Tributário Municipal. O Código Tributário de 2025 revogou o anterior e não define valor de referência, adotando apenas a UFIR (R$ 6,00). A base de cálculo das multas ficou indeterminada; se aplicada a UFIR, a multa do art. 108 seria de cerca de R$ 12,00.</w:t>
+      </w:r>
+    </w:p>
+    <w:p>
+      <w:pPr>
+        <w:spacing w:after="160" w:line="360"/>
+        <w:ind w:firstLine="709"/>
+        <w:jc w:val="both"/>
+      </w:pPr>
+      <w:r>
+        <w:t xml:space="preserve">Quórum: a alteração do Código de Posturas exige maioria absoluta (Lei Orgânica, art. 63, III) e tramitação de lei complementar em duas discussões (Regimento, art. 160, III).</w:t>
       </w:r>
     </w:p>
     <w:p>
@@ -1799,21 +1937,114 @@
         <w:spacing w:after="160" w:before="300"/>
       </w:pPr>
       <w:r>
-        <w:t xml:space="preserve">7. Pendências</w:t>
-      </w:r>
-    </w:p>
-    <w:p>
-      <w:pPr>
-        <w:pStyle w:val="ListParagraph"/>
-        <w:numPr>
-          <w:ilvl w:val="0"/>
-          <w:numId w:val="2"/>
-        </w:numPr>
-        <w:spacing w:after="80" w:line="320"/>
-        <w:jc w:val="both"/>
-      </w:pPr>
-      <w:r>
-        <w:t xml:space="preserve">obter o Código de Posturas de Miguel Alves e eventuais leis sobre animais;</w:t>
+        <w:t xml:space="preserve">7. Consequências para a estratégia</w:t>
+      </w:r>
+    </w:p>
+    <w:p>
+      <w:pPr>
+        <w:pStyle w:val="ListParagraph"/>
+        <w:numPr>
+          <w:ilvl w:val="0"/>
+          <w:numId w:val="3"/>
+        </w:numPr>
+        <w:spacing w:after="80" w:line="320"/>
+        <w:jc w:val="both"/>
+      </w:pPr>
+      <w:r>
+        <w:t xml:space="preserve">Argumento central: o Município proíbe animais nas vias e determina seu recolhimento desde 1995 (Código de Posturas, arts. 96 e 97), tem competência expressa (LOM, art. 8º, XXVI) e instituiu taxa pelo serviço (CTM, art. 358, I, e Anexo X); a ausência de apreensões efetivas caracteriza omissão específica, relevante para a responsabilidade civil (seção 3 do Relatório) e para eventual ação de obrigação de fazer.</w:t>
+      </w:r>
+    </w:p>
+    <w:p>
+      <w:pPr>
+        <w:pStyle w:val="ListParagraph"/>
+        <w:numPr>
+          <w:ilvl w:val="0"/>
+          <w:numId w:val="3"/>
+        </w:numPr>
+        <w:spacing w:after="80" w:line="320"/>
+        <w:jc w:val="both"/>
+      </w:pPr>
+      <w:r>
+        <w:t xml:space="preserve">Pedido de informações e certidão (LOM, art. 25; Lei nº 12.527/2011) sobre: número de apreensões desde março de 2026; arrecadação da TSMD referente a animais; órgão responsável e local de depósito; norma que define as hipóteses de apreensão; regulamento do art. 528; destinação dos animais não resgatados.</w:t>
+      </w:r>
+    </w:p>
+    <w:p>
+      <w:pPr>
+        <w:pStyle w:val="ListParagraph"/>
+        <w:numPr>
+          <w:ilvl w:val="0"/>
+          <w:numId w:val="3"/>
+        </w:numPr>
+        <w:spacing w:after="80" w:line="320"/>
+        <w:jc w:val="both"/>
+      </w:pPr>
+      <w:r>
+        <w:t xml:space="preserve">Projeto de lei complementar (popular ou parlamentar) que atualize o Capítulo V do Código de Posturas: procedimento de apreensão, multas em UFIR, destinação e revogação do sacrifício de cães, com remissão à TSMD, sem criar tributo nem órgão, aprovado por maioria absoluta.</w:t>
+      </w:r>
+    </w:p>
+    <w:p>
+      <w:pPr>
+        <w:pStyle w:val="ListParagraph"/>
+        <w:numPr>
+          <w:ilvl w:val="0"/>
+          <w:numId w:val="3"/>
+        </w:numPr>
+        <w:spacing w:after="80" w:line="320"/>
+        <w:jc w:val="both"/>
+      </w:pPr>
+      <w:r>
+        <w:t xml:space="preserve">Uso imediato do Código de Posturas: comunicação formal de infrações (art. 16) e autuação por qualquer pessoa com duas testemunhas (art. 108, parágrafo único), gerando prova documental da omissão administrativa.</w:t>
+      </w:r>
+    </w:p>
+    <w:p>
+      <w:pPr>
+        <w:pStyle w:val="ListParagraph"/>
+        <w:numPr>
+          <w:ilvl w:val="0"/>
+          <w:numId w:val="3"/>
+        </w:numPr>
+        <w:spacing w:after="80" w:line="320"/>
+        <w:jc w:val="both"/>
+      </w:pPr>
+      <w:r>
+        <w:t xml:space="preserve">Indicação ao Prefeito para estruturar o serviço de recolhimento e o depósito, regulamentar a TSMD de animais, incluir remoção e diárias e firmar convênio com o DER/PI.</w:t>
+      </w:r>
+    </w:p>
+    <w:p>
+      <w:pPr>
+        <w:pStyle w:val="ListParagraph"/>
+        <w:numPr>
+          <w:ilvl w:val="0"/>
+          <w:numId w:val="3"/>
+        </w:numPr>
+        <w:spacing w:after="80" w:line="320"/>
+        <w:jc w:val="both"/>
+      </w:pPr>
+      <w:r>
+        <w:t xml:space="preserve">Iniciativa popular com 5% do eleitorado (LOM, art. 67).</w:t>
+      </w:r>
+    </w:p>
+    <w:p>
+      <w:pPr>
+        <w:pStyle w:val="Heading1"/>
+        <w:spacing w:after="160" w:before="300"/>
+      </w:pPr>
+      <w:r>
+        <w:t xml:space="preserve">8. Pendências</w:t>
+      </w:r>
+    </w:p>
+    <w:p>
+      <w:pPr>
+        <w:pStyle w:val="ListParagraph"/>
+        <w:numPr>
+          <w:ilvl w:val="0"/>
+          <w:numId w:val="2"/>
+        </w:numPr>
+        <w:spacing w:after="80" w:line="320"/>
+        <w:jc w:val="both"/>
+      </w:pPr>
+      <w:r>
+        <w:t xml:space="preserve">verificar se a Lei nº 592/1995 sofreu alterações posteriores e se há outras leis municipais sobre animais;</w:t>
       </w:r>
     </w:p>
     <w:p>

</xml_diff>